<commit_message>
added a new file for instructions on running the project locally, updated the README with a link to this new file, and made some updates to the user guide and the script that generates it.
</commit_message>
<xml_diff>
--- a/Wizdent_CRM_User_Guide.docx
+++ b/Wizdent_CRM_User_Guide.docx
@@ -63,6 +63,26 @@
           <w:sz w:val="18"/>
         </w:rPr>
         <w:t>Document generated 5 June 2026  •  Web application (React + Firebase)</w:t>
+      </w:r>
+    </w:p>
+    <w:p>
+      <w:pPr>
+        <w:jc w:val="center"/>
+      </w:pPr>
+      <w:r>
+        <w:rPr>
+          <w:b/>
+          <w:color w:val="0F172A"/>
+          <w:sz w:val="20"/>
+        </w:rPr>
+        <w:t xml:space="preserve">Repository:  </w:t>
+      </w:r>
+      <w:r>
+        <w:rPr>
+          <w:color w:val="2563EB"/>
+          <w:sz w:val="20"/>
+        </w:rPr>
+        <w:t>https://github.com/NEMESIS-11/Wizdent-MVP</w:t>
       </w:r>
     </w:p>
     <w:p/>
@@ -4389,6 +4409,21 @@
         <w:rPr>
           <w:b w:val="0"/>
           <w:i w:val="0"/>
+          <w:color w:val="2563EB"/>
+          <w:sz w:val="20"/>
+        </w:rPr>
+        <w:t>Source code repository: https://github.com/NEMESIS-11/Wizdent-MVP — clone or download it from here, then follow RUNNING_LOCALLY.md in the repo to run the app on your own machine.</w:t>
+      </w:r>
+    </w:p>
+    <w:p>
+      <w:pPr>
+        <w:pStyle w:val="ListBullet"/>
+        <w:spacing w:after="60"/>
+      </w:pPr>
+      <w:r>
+        <w:rPr>
+          <w:b w:val="0"/>
+          <w:i w:val="0"/>
           <w:color w:val="DC2626"/>
           <w:sz w:val="20"/>
         </w:rPr>

</xml_diff>